<commit_message>
Ajustes en presentacion word
</commit_message>
<xml_diff>
--- a/plantillas/Plantilla2.docx
+++ b/plantillas/Plantilla2.docx
@@ -127,10 +127,6 @@
       <w:pPr>
         <w:pStyle w:val="Ttulo"/>
         <w:jc w:val="right"/>
-        <w:rPr>
-          <w:sz w:val="18"/>
-          <w:szCs w:val="18"/>
-        </w:rPr>
       </w:pPr>
       <w:r>
         <w:rPr>
@@ -140,47 +136,23 @@
         <w:t xml:space="preserve"> </w:t>
       </w:r>
       <w:r>
-        <w:rPr>
-          <w:sz w:val="18"/>
-          <w:szCs w:val="18"/>
-        </w:rPr>
         <w:t xml:space="preserve">Especificación Servicio WSDL </w:t>
       </w:r>
       <w:r>
-        <w:rPr>
-          <w:sz w:val="18"/>
-          <w:szCs w:val="18"/>
-        </w:rPr>
         <w:t>{</w:t>
       </w:r>
       <w:proofErr w:type="spellStart"/>
       <w:r>
-        <w:rPr>
-          <w:sz w:val="18"/>
-          <w:szCs w:val="18"/>
-        </w:rPr>
         <w:t>nombre_servicio</w:t>
       </w:r>
       <w:r>
-        <w:rPr>
-          <w:sz w:val="18"/>
-          <w:szCs w:val="18"/>
-        </w:rPr>
         <w:t>_</w:t>
       </w:r>
       <w:r>
-        <w:rPr>
-          <w:sz w:val="18"/>
-          <w:szCs w:val="18"/>
-        </w:rPr>
         <w:t>secundario</w:t>
       </w:r>
       <w:proofErr w:type="spellEnd"/>
       <w:r>
-        <w:rPr>
-          <w:sz w:val="18"/>
-          <w:szCs w:val="18"/>
-        </w:rPr>
         <w:t>}</w:t>
       </w:r>
     </w:p>
@@ -191,6 +163,8 @@
           <w:rFonts w:ascii="Arial" w:hAnsi="Arial" w:cs="Arial"/>
           <w:b/>
           <w:bCs/>
+          <w:sz w:val="36"/>
+          <w:szCs w:val="36"/>
         </w:rPr>
       </w:pPr>
       <w:r>
@@ -198,6 +172,8 @@
           <w:rFonts w:ascii="Arial" w:hAnsi="Arial" w:cs="Arial"/>
           <w:b/>
           <w:bCs/>
+          <w:sz w:val="36"/>
+          <w:szCs w:val="36"/>
         </w:rPr>
         <w:t>Operación {</w:t>
       </w:r>
@@ -207,6 +183,8 @@
           <w:rFonts w:ascii="Arial" w:hAnsi="Arial" w:cs="Arial"/>
           <w:b/>
           <w:bCs/>
+          <w:sz w:val="36"/>
+          <w:szCs w:val="36"/>
         </w:rPr>
         <w:t>nombre_operacion</w:t>
       </w:r>
@@ -215,6 +193,8 @@
           <w:rFonts w:ascii="Arial" w:hAnsi="Arial" w:cs="Arial"/>
           <w:b/>
           <w:bCs/>
+          <w:sz w:val="36"/>
+          <w:szCs w:val="36"/>
         </w:rPr>
         <w:t>_inicial</w:t>
       </w:r>
@@ -224,6 +204,8 @@
           <w:rFonts w:ascii="Arial" w:hAnsi="Arial" w:cs="Arial"/>
           <w:b/>
           <w:bCs/>
+          <w:sz w:val="36"/>
+          <w:szCs w:val="36"/>
         </w:rPr>
         <w:t>}</w:t>
       </w:r>
@@ -235,8 +217,8 @@
           <w:rFonts w:ascii="Arial" w:eastAsia="Arial" w:hAnsi="Arial" w:cs="Arial"/>
           <w:b/>
           <w:bCs/>
-          <w:sz w:val="18"/>
-          <w:szCs w:val="18"/>
+          <w:sz w:val="36"/>
+          <w:szCs w:val="36"/>
         </w:rPr>
       </w:pPr>
       <w:r>
@@ -244,8 +226,8 @@
           <w:rFonts w:ascii="Arial" w:hAnsi="Arial" w:cs="Arial"/>
           <w:b/>
           <w:bCs/>
-          <w:sz w:val="18"/>
-          <w:szCs w:val="18"/>
+          <w:sz w:val="36"/>
+          <w:szCs w:val="36"/>
         </w:rPr>
         <w:t>Banco Caja Social</w:t>
       </w:r>
@@ -595,7 +577,6 @@
                 <w:szCs w:val="18"/>
               </w:rPr>
             </w:pPr>
-            <w:proofErr w:type="spellStart"/>
             <w:r>
               <w:rPr>
                 <w:rFonts w:ascii="Arial" w:eastAsia="Arial" w:hAnsi="Arial" w:cs="Arial"/>
@@ -603,9 +584,8 @@
                 <w:sz w:val="18"/>
                 <w:szCs w:val="18"/>
               </w:rPr>
-              <w:t>Version</w:t>
-            </w:r>
-            <w:proofErr w:type="spellEnd"/>
+              <w:t>Versi</w:t>
+            </w:r>
             <w:r>
               <w:rPr>
                 <w:rFonts w:ascii="Arial" w:eastAsia="Arial" w:hAnsi="Arial" w:cs="Arial"/>
@@ -613,7 +593,16 @@
                 <w:sz w:val="18"/>
                 <w:szCs w:val="18"/>
               </w:rPr>
-              <w:t xml:space="preserve"> inicial</w:t>
+              <w:t>ó</w:t>
+            </w:r>
+            <w:r>
+              <w:rPr>
+                <w:rFonts w:ascii="Arial" w:eastAsia="Arial" w:hAnsi="Arial" w:cs="Arial"/>
+                <w:color w:val="000000"/>
+                <w:sz w:val="18"/>
+                <w:szCs w:val="18"/>
+              </w:rPr>
+              <w:t>n inicial</w:t>
             </w:r>
           </w:p>
           <w:p>
@@ -1334,7 +1323,7 @@
             </w:rPr>
             <w:fldChar w:fldCharType="separate"/>
           </w:r>
-          <w:hyperlink w:anchor="_Toc194671316" w:history="1">
+          <w:hyperlink w:anchor="_Toc233265007" w:history="1">
             <w:r>
               <w:rPr>
                 <w:rStyle w:val="Hipervnculo"/>
@@ -1379,7 +1368,7 @@
                 <w:noProof/>
                 <w:webHidden/>
               </w:rPr>
-              <w:instrText xml:space="preserve"> PAGEREF _Toc194671316 \h </w:instrText>
+              <w:instrText xml:space="preserve"> PAGEREF _Toc233265007 \h </w:instrText>
             </w:r>
             <w:r>
               <w:rPr>
@@ -1426,7 +1415,7 @@
               <w14:ligatures w14:val="standardContextual"/>
             </w:rPr>
           </w:pPr>
-          <w:hyperlink w:anchor="_Toc194671317" w:history="1">
+          <w:hyperlink w:anchor="_Toc233265008" w:history="1">
             <w:r>
               <w:rPr>
                 <w:rStyle w:val="Hipervnculo"/>
@@ -1450,7 +1439,7 @@
                 <w:rStyle w:val="Hipervnculo"/>
                 <w:noProof/>
               </w:rPr>
-              <w:t>Servicio {nombre_servicio}</w:t>
+              <w:t>{nombre_servicio}</w:t>
             </w:r>
             <w:r>
               <w:rPr>
@@ -1471,99 +1460,7 @@
                 <w:noProof/>
                 <w:webHidden/>
               </w:rPr>
-              <w:instrText xml:space="preserve"> PAGEREF _Toc194671317 \h </w:instrText>
-            </w:r>
-            <w:r>
-              <w:rPr>
-                <w:noProof/>
-                <w:webHidden/>
-              </w:rPr>
-            </w:r>
-            <w:r>
-              <w:rPr>
-                <w:noProof/>
-                <w:webHidden/>
-              </w:rPr>
-              <w:fldChar w:fldCharType="separate"/>
-            </w:r>
-            <w:r>
-              <w:rPr>
-                <w:noProof/>
-                <w:webHidden/>
-              </w:rPr>
-              <w:t>4</w:t>
-            </w:r>
-            <w:r>
-              <w:rPr>
-                <w:noProof/>
-                <w:webHidden/>
-              </w:rPr>
-              <w:fldChar w:fldCharType="end"/>
-            </w:r>
-          </w:hyperlink>
-        </w:p>
-        <w:p>
-          <w:pPr>
-            <w:pStyle w:val="TDC2"/>
-            <w:tabs>
-              <w:tab w:val="left" w:pos="990"/>
-              <w:tab w:val="right" w:pos="8828"/>
-            </w:tabs>
-            <w:rPr>
-              <w:rFonts w:asciiTheme="minorHAnsi" w:eastAsiaTheme="minorEastAsia" w:hAnsiTheme="minorHAnsi" w:cstheme="minorBidi"/>
-              <w:noProof/>
-              <w:kern w:val="2"/>
-              <w:sz w:val="22"/>
-              <w:szCs w:val="22"/>
-              <w14:ligatures w14:val="standardContextual"/>
-            </w:rPr>
-          </w:pPr>
-          <w:hyperlink w:anchor="_Toc194671318" w:history="1">
-            <w:r>
-              <w:rPr>
-                <w:rStyle w:val="Hipervnculo"/>
-                <w:noProof/>
-              </w:rPr>
-              <w:t>2.1</w:t>
-            </w:r>
-            <w:r>
-              <w:rPr>
-                <w:rFonts w:asciiTheme="minorHAnsi" w:eastAsiaTheme="minorEastAsia" w:hAnsiTheme="minorHAnsi" w:cstheme="minorBidi"/>
-                <w:noProof/>
-                <w:kern w:val="2"/>
-                <w:sz w:val="22"/>
-                <w:szCs w:val="22"/>
-                <w14:ligatures w14:val="standardContextual"/>
-              </w:rPr>
-              <w:tab/>
-            </w:r>
-            <w:r>
-              <w:rPr>
-                <w:rStyle w:val="Hipervnculo"/>
-                <w:noProof/>
-              </w:rPr>
-              <w:t>Operación {nombre_operacion}</w:t>
-            </w:r>
-            <w:r>
-              <w:rPr>
-                <w:noProof/>
-                <w:webHidden/>
-              </w:rPr>
-              <w:tab/>
-            </w:r>
-            <w:r>
-              <w:rPr>
-                <w:noProof/>
-                <w:webHidden/>
-              </w:rPr>
-              <w:fldChar w:fldCharType="begin"/>
-            </w:r>
-            <w:r>
-              <w:rPr>
-                <w:noProof/>
-                <w:webHidden/>
-              </w:rPr>
-              <w:instrText xml:space="preserve"> PAGEREF _Toc194671318 \h </w:instrText>
+              <w:instrText xml:space="preserve"> PAGEREF _Toc233265008 \h </w:instrText>
             </w:r>
             <w:r>
               <w:rPr>
@@ -1610,13 +1507,13 @@
               <w14:ligatures w14:val="standardContextual"/>
             </w:rPr>
           </w:pPr>
-          <w:hyperlink w:anchor="_Toc194671319" w:history="1">
+          <w:hyperlink w:anchor="_Toc233265009" w:history="1">
             <w:r>
               <w:rPr>
                 <w:rStyle w:val="Hipervnculo"/>
                 <w:noProof/>
               </w:rPr>
-              <w:t>2.1.1</w:t>
+              <w:t>3.</w:t>
             </w:r>
             <w:r>
               <w:rPr>
@@ -1634,7 +1531,7 @@
                 <w:rStyle w:val="Hipervnculo"/>
                 <w:noProof/>
               </w:rPr>
-              <w:t>Diagrama secuencia {nombre_operacion}</w:t>
+              <w:t>Operación {nombre_operacion}</w:t>
             </w:r>
             <w:r>
               <w:rPr>
@@ -1655,7 +1552,7 @@
                 <w:noProof/>
                 <w:webHidden/>
               </w:rPr>
-              <w:instrText xml:space="preserve"> PAGEREF _Toc194671319 \h </w:instrText>
+              <w:instrText xml:space="preserve"> PAGEREF _Toc233265009 \h </w:instrText>
             </w:r>
             <w:r>
               <w:rPr>
@@ -1675,7 +1572,7 @@
                 <w:noProof/>
                 <w:webHidden/>
               </w:rPr>
-              <w:t>5</w:t>
+              <w:t>4</w:t>
             </w:r>
             <w:r>
               <w:rPr>
@@ -1702,13 +1599,13 @@
               <w14:ligatures w14:val="standardContextual"/>
             </w:rPr>
           </w:pPr>
-          <w:hyperlink w:anchor="_Toc194671320" w:history="1">
+          <w:hyperlink w:anchor="_Toc233265010" w:history="1">
             <w:r>
               <w:rPr>
                 <w:rStyle w:val="Hipervnculo"/>
                 <w:noProof/>
               </w:rPr>
-              <w:t>2.1.2</w:t>
+              <w:t>4.</w:t>
             </w:r>
             <w:r>
               <w:rPr>
@@ -1726,7 +1623,7 @@
                 <w:rStyle w:val="Hipervnculo"/>
                 <w:noProof/>
               </w:rPr>
-              <w:t>Request</w:t>
+              <w:t>Diagrama secuencia {nombre_operacion}</w:t>
             </w:r>
             <w:r>
               <w:rPr>
@@ -1747,7 +1644,7 @@
                 <w:noProof/>
                 <w:webHidden/>
               </w:rPr>
-              <w:instrText xml:space="preserve"> PAGEREF _Toc194671320 \h </w:instrText>
+              <w:instrText xml:space="preserve"> PAGEREF _Toc233265010 \h </w:instrText>
             </w:r>
             <w:r>
               <w:rPr>
@@ -1767,7 +1664,7 @@
                 <w:noProof/>
                 <w:webHidden/>
               </w:rPr>
-              <w:t>6</w:t>
+              <w:t>5</w:t>
             </w:r>
             <w:r>
               <w:rPr>
@@ -1794,13 +1691,13 @@
               <w14:ligatures w14:val="standardContextual"/>
             </w:rPr>
           </w:pPr>
-          <w:hyperlink w:anchor="_Toc194671321" w:history="1">
+          <w:hyperlink w:anchor="_Toc233265011" w:history="1">
             <w:r>
               <w:rPr>
                 <w:rStyle w:val="Hipervnculo"/>
                 <w:noProof/>
               </w:rPr>
-              <w:t>2.1.3</w:t>
+              <w:t>5.</w:t>
             </w:r>
             <w:r>
               <w:rPr>
@@ -1818,7 +1715,7 @@
                 <w:rStyle w:val="Hipervnculo"/>
                 <w:noProof/>
               </w:rPr>
-              <w:t>Response</w:t>
+              <w:t>Request</w:t>
             </w:r>
             <w:r>
               <w:rPr>
@@ -1839,7 +1736,99 @@
                 <w:noProof/>
                 <w:webHidden/>
               </w:rPr>
-              <w:instrText xml:space="preserve"> PAGEREF _Toc194671321 \h </w:instrText>
+              <w:instrText xml:space="preserve"> PAGEREF _Toc233265011 \h </w:instrText>
+            </w:r>
+            <w:r>
+              <w:rPr>
+                <w:noProof/>
+                <w:webHidden/>
+              </w:rPr>
+            </w:r>
+            <w:r>
+              <w:rPr>
+                <w:noProof/>
+                <w:webHidden/>
+              </w:rPr>
+              <w:fldChar w:fldCharType="separate"/>
+            </w:r>
+            <w:r>
+              <w:rPr>
+                <w:noProof/>
+                <w:webHidden/>
+              </w:rPr>
+              <w:t>6</w:t>
+            </w:r>
+            <w:r>
+              <w:rPr>
+                <w:noProof/>
+                <w:webHidden/>
+              </w:rPr>
+              <w:fldChar w:fldCharType="end"/>
+            </w:r>
+          </w:hyperlink>
+        </w:p>
+        <w:p>
+          <w:pPr>
+            <w:pStyle w:val="TDC1"/>
+            <w:tabs>
+              <w:tab w:val="left" w:pos="990"/>
+              <w:tab w:val="right" w:pos="8828"/>
+            </w:tabs>
+            <w:rPr>
+              <w:rFonts w:asciiTheme="minorHAnsi" w:eastAsiaTheme="minorEastAsia" w:hAnsiTheme="minorHAnsi" w:cstheme="minorBidi"/>
+              <w:noProof/>
+              <w:kern w:val="2"/>
+              <w:sz w:val="22"/>
+              <w:szCs w:val="22"/>
+              <w14:ligatures w14:val="standardContextual"/>
+            </w:rPr>
+          </w:pPr>
+          <w:hyperlink w:anchor="_Toc233265012" w:history="1">
+            <w:r>
+              <w:rPr>
+                <w:rStyle w:val="Hipervnculo"/>
+                <w:noProof/>
+              </w:rPr>
+              <w:t>6.</w:t>
+            </w:r>
+            <w:r>
+              <w:rPr>
+                <w:rFonts w:asciiTheme="minorHAnsi" w:eastAsiaTheme="minorEastAsia" w:hAnsiTheme="minorHAnsi" w:cstheme="minorBidi"/>
+                <w:noProof/>
+                <w:kern w:val="2"/>
+                <w:sz w:val="22"/>
+                <w:szCs w:val="22"/>
+                <w14:ligatures w14:val="standardContextual"/>
+              </w:rPr>
+              <w:tab/>
+            </w:r>
+            <w:r>
+              <w:rPr>
+                <w:rStyle w:val="Hipervnculo"/>
+                <w:noProof/>
+              </w:rPr>
+              <w:t>Response</w:t>
+            </w:r>
+            <w:r>
+              <w:rPr>
+                <w:noProof/>
+                <w:webHidden/>
+              </w:rPr>
+              <w:tab/>
+            </w:r>
+            <w:r>
+              <w:rPr>
+                <w:noProof/>
+                <w:webHidden/>
+              </w:rPr>
+              <w:fldChar w:fldCharType="begin"/>
+            </w:r>
+            <w:r>
+              <w:rPr>
+                <w:noProof/>
+                <w:webHidden/>
+              </w:rPr>
+              <w:instrText xml:space="preserve"> PAGEREF _Toc233265012 \h </w:instrText>
             </w:r>
             <w:r>
               <w:rPr>
@@ -2365,7 +2354,7 @@
           <w:szCs w:val="20"/>
         </w:rPr>
       </w:pPr>
-      <w:bookmarkStart w:id="0" w:name="_Toc194671316"/>
+      <w:bookmarkStart w:id="0" w:name="_Toc233265007"/>
       <w:r>
         <w:rPr>
           <w:sz w:val="20"/>
@@ -2721,7 +2710,7 @@
           <w:szCs w:val="20"/>
         </w:rPr>
       </w:pPr>
-      <w:bookmarkStart w:id="2" w:name="_Toc194671317"/>
+      <w:bookmarkStart w:id="2" w:name="_Toc233265008"/>
       <w:r>
         <w:rPr>
           <w:sz w:val="20"/>
@@ -2955,69 +2944,91 @@
     </w:p>
     <w:p>
       <w:pPr>
-        <w:pStyle w:val="Ttulo2"/>
+        <w:pStyle w:val="Ttulo1"/>
         <w:numPr>
-          <w:ilvl w:val="1"/>
-          <w:numId w:val="26"/>
+          <w:ilvl w:val="0"/>
+          <w:numId w:val="4"/>
         </w:numPr>
       </w:pPr>
-      <w:bookmarkStart w:id="4" w:name="_Toc194671318"/>
+      <w:bookmarkStart w:id="4" w:name="_Toc233265009"/>
       <w:r>
         <w:rPr>
-          <w:sz w:val="18"/>
-          <w:szCs w:val="18"/>
-        </w:rPr>
-        <w:t xml:space="preserve">Operación </w:t>
+          <w:sz w:val="20"/>
+          <w:szCs w:val="20"/>
+        </w:rPr>
+        <w:t>Operación</w:t>
       </w:r>
       <w:r>
-        <w:t>{nombre_operacion}</w:t>
+        <w:rPr>
+          <w:sz w:val="18"/>
+          <w:szCs w:val="18"/>
+        </w:rPr>
+        <w:t xml:space="preserve"> </w:t>
       </w:r>
-      <w:bookmarkEnd w:id="4"/>
-    </w:p>
-    <w:p>
-      <w:pPr>
-        <w:pStyle w:val="Prrafodelista"/>
-        <w:ind w:left="568"/>
-        <w:jc w:val="both"/>
-        <w:rPr>
-          <w:rFonts w:ascii="Arial" w:eastAsia="Arial" w:hAnsi="Arial"/>
-          <w:bCs/>
-          <w:sz w:val="18"/>
-          <w:szCs w:val="18"/>
-          <w:lang w:eastAsia="en-US"/>
-        </w:rPr>
-      </w:pPr>
-    </w:p>
-    <w:p>
-      <w:pPr>
-        <w:ind w:left="567" w:hanging="567"/>
-        <w:jc w:val="both"/>
-        <w:rPr>
-          <w:rFonts w:ascii="Arial" w:eastAsia="Arial" w:hAnsi="Arial"/>
-          <w:bCs/>
-          <w:sz w:val="18"/>
-          <w:szCs w:val="18"/>
-          <w:lang w:eastAsia="en-US"/>
-        </w:rPr>
-      </w:pPr>
       <w:r>
-        <w:rPr>
-          <w:sz w:val="18"/>
-          <w:szCs w:val="18"/>
-        </w:rPr>
         <w:t>{</w:t>
       </w:r>
       <w:proofErr w:type="spellStart"/>
       <w:r>
         <w:rPr>
-          <w:sz w:val="18"/>
-          <w:szCs w:val="18"/>
+          <w:sz w:val="20"/>
+          <w:szCs w:val="20"/>
         </w:rPr>
         <w:t>nombre_operacion</w:t>
       </w:r>
       <w:proofErr w:type="spellEnd"/>
       <w:r>
-        <w:rPr>
+        <w:t>}</w:t>
+      </w:r>
+      <w:bookmarkEnd w:id="4"/>
+    </w:p>
+    <w:p>
+      <w:pPr>
+        <w:pStyle w:val="Prrafodelista"/>
+        <w:ind w:left="568"/>
+        <w:jc w:val="both"/>
+        <w:rPr>
+          <w:rFonts w:ascii="Arial" w:eastAsia="Arial" w:hAnsi="Arial"/>
+          <w:bCs/>
+          <w:sz w:val="18"/>
+          <w:szCs w:val="18"/>
+          <w:lang w:eastAsia="en-US"/>
+        </w:rPr>
+      </w:pPr>
+    </w:p>
+    <w:p>
+      <w:pPr>
+        <w:ind w:left="567" w:hanging="567"/>
+        <w:jc w:val="both"/>
+        <w:rPr>
+          <w:rFonts w:ascii="Arial" w:eastAsia="Arial" w:hAnsi="Arial"/>
+          <w:bCs/>
+          <w:sz w:val="18"/>
+          <w:szCs w:val="18"/>
+          <w:lang w:eastAsia="en-US"/>
+        </w:rPr>
+      </w:pPr>
+      <w:r>
+        <w:rPr>
+          <w:rFonts w:ascii="Arial" w:hAnsi="Arial" w:cs="Arial"/>
+          <w:sz w:val="18"/>
+          <w:szCs w:val="18"/>
+        </w:rPr>
+        <w:t>{</w:t>
+      </w:r>
+      <w:proofErr w:type="spellStart"/>
+      <w:r>
+        <w:rPr>
+          <w:rFonts w:ascii="Arial" w:hAnsi="Arial" w:cs="Arial"/>
+          <w:sz w:val="18"/>
+          <w:szCs w:val="18"/>
+        </w:rPr>
+        <w:t>nombre_operacion</w:t>
+      </w:r>
+      <w:proofErr w:type="spellEnd"/>
+      <w:r>
+        <w:rPr>
+          <w:rFonts w:ascii="Arial" w:hAnsi="Arial" w:cs="Arial"/>
           <w:sz w:val="18"/>
           <w:szCs w:val="18"/>
         </w:rPr>
@@ -3025,7 +3036,7 @@
       </w:r>
       <w:r>
         <w:rPr>
-          <w:rFonts w:ascii="Arial" w:eastAsia="Arial" w:hAnsi="Arial"/>
+          <w:rFonts w:ascii="Arial" w:eastAsia="Arial" w:hAnsi="Arial" w:cs="Arial"/>
           <w:bCs/>
           <w:sz w:val="18"/>
           <w:szCs w:val="18"/>
@@ -3035,13 +3046,23 @@
       </w:r>
       <w:r>
         <w:rPr>
+          <w:rFonts w:ascii="Arial" w:eastAsia="Arial" w:hAnsi="Arial" w:cs="Arial"/>
+          <w:bCs/>
+          <w:sz w:val="18"/>
+          <w:szCs w:val="18"/>
+          <w:lang w:eastAsia="en-US"/>
+        </w:rPr>
+        <w:t>a operación que internamente consume los siguientes legados</w:t>
+      </w:r>
+      <w:r>
+        <w:rPr>
           <w:rFonts w:ascii="Arial" w:eastAsia="Arial" w:hAnsi="Arial"/>
           <w:bCs/>
           <w:sz w:val="18"/>
           <w:szCs w:val="18"/>
           <w:lang w:eastAsia="en-US"/>
         </w:rPr>
-        <w:t>a operación que internamente consume los siguientes legados:</w:t>
+        <w:t>:</w:t>
       </w:r>
     </w:p>
     <w:p>
@@ -3431,36 +3452,22 @@
       <w:pPr>
         <w:pStyle w:val="Ttulo1"/>
         <w:numPr>
-          <w:ilvl w:val="2"/>
-          <w:numId w:val="26"/>
+          <w:ilvl w:val="0"/>
+          <w:numId w:val="4"/>
         </w:numPr>
-        <w:rPr>
-          <w:sz w:val="18"/>
-          <w:szCs w:val="18"/>
-        </w:rPr>
-      </w:pPr>
-      <w:bookmarkStart w:id="5" w:name="_Toc194671319"/>
-      <w:r>
         <w:rPr>
           <w:sz w:val="20"/>
           <w:szCs w:val="20"/>
         </w:rPr>
-        <w:lastRenderedPageBreak/>
-        <w:t>Diagrama secuencia</w:t>
-      </w:r>
+      </w:pPr>
+      <w:bookmarkStart w:id="5" w:name="_Toc233265010"/>
       <w:r>
         <w:rPr>
           <w:sz w:val="20"/>
           <w:szCs w:val="20"/>
         </w:rPr>
-        <w:t xml:space="preserve"> </w:t>
-      </w:r>
-      <w:r>
-        <w:rPr>
-          <w:sz w:val="20"/>
-          <w:szCs w:val="20"/>
-        </w:rPr>
-        <w:t>{</w:t>
+        <w:lastRenderedPageBreak/>
+        <w:t>Diagrama secuencia {</w:t>
       </w:r>
       <w:proofErr w:type="spellStart"/>
       <w:r>
@@ -3532,15 +3539,15 @@
       <w:pPr>
         <w:pStyle w:val="Ttulo1"/>
         <w:numPr>
-          <w:ilvl w:val="2"/>
-          <w:numId w:val="26"/>
+          <w:ilvl w:val="0"/>
+          <w:numId w:val="4"/>
         </w:numPr>
         <w:rPr>
           <w:sz w:val="20"/>
           <w:szCs w:val="20"/>
         </w:rPr>
       </w:pPr>
-      <w:bookmarkStart w:id="6" w:name="_Toc194671320"/>
+      <w:bookmarkStart w:id="6" w:name="_Toc233265011"/>
       <w:proofErr w:type="spellStart"/>
       <w:r>
         <w:rPr>
@@ -4264,15 +4271,15 @@
       <w:pPr>
         <w:pStyle w:val="Ttulo1"/>
         <w:numPr>
-          <w:ilvl w:val="2"/>
-          <w:numId w:val="26"/>
+          <w:ilvl w:val="0"/>
+          <w:numId w:val="4"/>
         </w:numPr>
         <w:rPr>
           <w:sz w:val="20"/>
           <w:szCs w:val="20"/>
         </w:rPr>
       </w:pPr>
-      <w:bookmarkStart w:id="7" w:name="_Toc194671321"/>
+      <w:bookmarkStart w:id="7" w:name="_Toc233265012"/>
       <w:r>
         <w:rPr>
           <w:sz w:val="20"/>
@@ -7183,6 +7190,119 @@
     </w:lvl>
   </w:abstractNum>
   <w:abstractNum w:abstractNumId="13" w15:restartNumberingAfterBreak="0">
+    <w:nsid w:val="303B78F7"/>
+    <w:multiLevelType w:val="multilevel"/>
+    <w:tmpl w:val="A22E6260"/>
+    <w:lvl w:ilvl="0">
+      <w:start w:val="2"/>
+      <w:numFmt w:val="decimal"/>
+      <w:lvlText w:val="%1"/>
+      <w:lvlJc w:val="left"/>
+      <w:pPr>
+        <w:ind w:left="360" w:hanging="360"/>
+      </w:pPr>
+      <w:rPr>
+        <w:rFonts w:hint="default"/>
+      </w:rPr>
+    </w:lvl>
+    <w:lvl w:ilvl="1">
+      <w:start w:val="1"/>
+      <w:numFmt w:val="decimal"/>
+      <w:lvlText w:val="%1.%2"/>
+      <w:lvlJc w:val="left"/>
+      <w:pPr>
+        <w:ind w:left="785" w:hanging="360"/>
+      </w:pPr>
+      <w:rPr>
+        <w:rFonts w:hint="default"/>
+      </w:rPr>
+    </w:lvl>
+    <w:lvl w:ilvl="2">
+      <w:start w:val="1"/>
+      <w:numFmt w:val="decimal"/>
+      <w:lvlText w:val="%1.%2.%3"/>
+      <w:lvlJc w:val="left"/>
+      <w:pPr>
+        <w:ind w:left="1570" w:hanging="720"/>
+      </w:pPr>
+      <w:rPr>
+        <w:rFonts w:hint="default"/>
+      </w:rPr>
+    </w:lvl>
+    <w:lvl w:ilvl="3">
+      <w:start w:val="1"/>
+      <w:numFmt w:val="decimal"/>
+      <w:lvlText w:val="%1.%2.%3.%4"/>
+      <w:lvlJc w:val="left"/>
+      <w:pPr>
+        <w:ind w:left="1995" w:hanging="720"/>
+      </w:pPr>
+      <w:rPr>
+        <w:rFonts w:hint="default"/>
+      </w:rPr>
+    </w:lvl>
+    <w:lvl w:ilvl="4">
+      <w:start w:val="1"/>
+      <w:numFmt w:val="decimal"/>
+      <w:lvlText w:val="%1.%2.%3.%4.%5"/>
+      <w:lvlJc w:val="left"/>
+      <w:pPr>
+        <w:ind w:left="2420" w:hanging="720"/>
+      </w:pPr>
+      <w:rPr>
+        <w:rFonts w:hint="default"/>
+      </w:rPr>
+    </w:lvl>
+    <w:lvl w:ilvl="5">
+      <w:start w:val="1"/>
+      <w:numFmt w:val="decimal"/>
+      <w:lvlText w:val="%1.%2.%3.%4.%5.%6"/>
+      <w:lvlJc w:val="left"/>
+      <w:pPr>
+        <w:ind w:left="3205" w:hanging="1080"/>
+      </w:pPr>
+      <w:rPr>
+        <w:rFonts w:hint="default"/>
+      </w:rPr>
+    </w:lvl>
+    <w:lvl w:ilvl="6">
+      <w:start w:val="1"/>
+      <w:numFmt w:val="decimal"/>
+      <w:lvlText w:val="%1.%2.%3.%4.%5.%6.%7"/>
+      <w:lvlJc w:val="left"/>
+      <w:pPr>
+        <w:ind w:left="3630" w:hanging="1080"/>
+      </w:pPr>
+      <w:rPr>
+        <w:rFonts w:hint="default"/>
+      </w:rPr>
+    </w:lvl>
+    <w:lvl w:ilvl="7">
+      <w:start w:val="1"/>
+      <w:numFmt w:val="decimal"/>
+      <w:lvlText w:val="%1.%2.%3.%4.%5.%6.%7.%8"/>
+      <w:lvlJc w:val="left"/>
+      <w:pPr>
+        <w:ind w:left="4415" w:hanging="1440"/>
+      </w:pPr>
+      <w:rPr>
+        <w:rFonts w:hint="default"/>
+      </w:rPr>
+    </w:lvl>
+    <w:lvl w:ilvl="8">
+      <w:start w:val="1"/>
+      <w:numFmt w:val="decimal"/>
+      <w:lvlText w:val="%1.%2.%3.%4.%5.%6.%7.%8.%9"/>
+      <w:lvlJc w:val="left"/>
+      <w:pPr>
+        <w:ind w:left="4840" w:hanging="1440"/>
+      </w:pPr>
+      <w:rPr>
+        <w:rFonts w:hint="default"/>
+      </w:rPr>
+    </w:lvl>
+  </w:abstractNum>
+  <w:abstractNum w:abstractNumId="14" w15:restartNumberingAfterBreak="0">
     <w:nsid w:val="31067A89"/>
     <w:multiLevelType w:val="hybridMultilevel"/>
     <w:tmpl w:val="09B22EDA"/>
@@ -7295,7 +7415,7 @@
       </w:rPr>
     </w:lvl>
   </w:abstractNum>
-  <w:abstractNum w:abstractNumId="14" w15:restartNumberingAfterBreak="0">
+  <w:abstractNum w:abstractNumId="15" w15:restartNumberingAfterBreak="0">
     <w:nsid w:val="325D516A"/>
     <w:multiLevelType w:val="multilevel"/>
     <w:tmpl w:val="17043DA2"/>
@@ -7409,7 +7529,7 @@
       </w:rPr>
     </w:lvl>
   </w:abstractNum>
-  <w:abstractNum w:abstractNumId="15" w15:restartNumberingAfterBreak="0">
+  <w:abstractNum w:abstractNumId="16" w15:restartNumberingAfterBreak="0">
     <w:nsid w:val="341C4859"/>
     <w:multiLevelType w:val="multilevel"/>
     <w:tmpl w:val="F2DEE4F0"/>
@@ -7524,7 +7644,7 @@
       </w:rPr>
     </w:lvl>
   </w:abstractNum>
-  <w:abstractNum w:abstractNumId="16" w15:restartNumberingAfterBreak="0">
+  <w:abstractNum w:abstractNumId="17" w15:restartNumberingAfterBreak="0">
     <w:nsid w:val="3FA32163"/>
     <w:multiLevelType w:val="multilevel"/>
     <w:tmpl w:val="F2DEE4F0"/>
@@ -7639,7 +7759,7 @@
       </w:rPr>
     </w:lvl>
   </w:abstractNum>
-  <w:abstractNum w:abstractNumId="17" w15:restartNumberingAfterBreak="0">
+  <w:abstractNum w:abstractNumId="18" w15:restartNumberingAfterBreak="0">
     <w:nsid w:val="411468D4"/>
     <w:multiLevelType w:val="multilevel"/>
     <w:tmpl w:val="B6FC5F42"/>
@@ -7752,7 +7872,7 @@
       </w:rPr>
     </w:lvl>
   </w:abstractNum>
-  <w:abstractNum w:abstractNumId="18" w15:restartNumberingAfterBreak="0">
+  <w:abstractNum w:abstractNumId="19" w15:restartNumberingAfterBreak="0">
     <w:nsid w:val="4C144FAA"/>
     <w:multiLevelType w:val="multilevel"/>
     <w:tmpl w:val="DE40E54A"/>
@@ -7901,7 +8021,7 @@
       </w:rPr>
     </w:lvl>
   </w:abstractNum>
-  <w:abstractNum w:abstractNumId="19" w15:restartNumberingAfterBreak="0">
+  <w:abstractNum w:abstractNumId="20" w15:restartNumberingAfterBreak="0">
     <w:nsid w:val="4C79029B"/>
     <w:multiLevelType w:val="multilevel"/>
     <w:tmpl w:val="F2DEE4F0"/>
@@ -8016,7 +8136,7 @@
       </w:rPr>
     </w:lvl>
   </w:abstractNum>
-  <w:abstractNum w:abstractNumId="20" w15:restartNumberingAfterBreak="0">
+  <w:abstractNum w:abstractNumId="21" w15:restartNumberingAfterBreak="0">
     <w:nsid w:val="4DF44C5C"/>
     <w:multiLevelType w:val="multilevel"/>
     <w:tmpl w:val="F2DEE4F0"/>
@@ -8131,7 +8251,7 @@
       </w:rPr>
     </w:lvl>
   </w:abstractNum>
-  <w:abstractNum w:abstractNumId="21" w15:restartNumberingAfterBreak="0">
+  <w:abstractNum w:abstractNumId="22" w15:restartNumberingAfterBreak="0">
     <w:nsid w:val="5C155751"/>
     <w:multiLevelType w:val="hybridMultilevel"/>
     <w:tmpl w:val="2B1A02AC"/>
@@ -8244,7 +8364,7 @@
       </w:rPr>
     </w:lvl>
   </w:abstractNum>
-  <w:abstractNum w:abstractNumId="22" w15:restartNumberingAfterBreak="0">
+  <w:abstractNum w:abstractNumId="23" w15:restartNumberingAfterBreak="0">
     <w:nsid w:val="672C4BC2"/>
     <w:multiLevelType w:val="hybridMultilevel"/>
     <w:tmpl w:val="18782AC8"/>
@@ -8357,10 +8477,10 @@
       </w:rPr>
     </w:lvl>
   </w:abstractNum>
-  <w:abstractNum w:abstractNumId="23" w15:restartNumberingAfterBreak="0">
+  <w:abstractNum w:abstractNumId="24" w15:restartNumberingAfterBreak="0">
     <w:nsid w:val="679E5BDC"/>
     <w:multiLevelType w:val="multilevel"/>
-    <w:tmpl w:val="B7D0563C"/>
+    <w:tmpl w:val="17AC704A"/>
     <w:lvl w:ilvl="0">
       <w:start w:val="1"/>
       <w:numFmt w:val="decimal"/>
@@ -8370,6 +8490,8 @@
         <w:ind w:left="928" w:hanging="360"/>
       </w:pPr>
       <w:rPr>
+        <w:sz w:val="20"/>
+        <w:szCs w:val="20"/>
         <w:vertAlign w:val="baseline"/>
       </w:rPr>
     </w:lvl>
@@ -8470,7 +8592,7 @@
       </w:rPr>
     </w:lvl>
   </w:abstractNum>
-  <w:abstractNum w:abstractNumId="24" w15:restartNumberingAfterBreak="0">
+  <w:abstractNum w:abstractNumId="25" w15:restartNumberingAfterBreak="0">
     <w:nsid w:val="725201E9"/>
     <w:multiLevelType w:val="hybridMultilevel"/>
     <w:tmpl w:val="D22C97A4"/>
@@ -8583,7 +8705,7 @@
       </w:rPr>
     </w:lvl>
   </w:abstractNum>
-  <w:abstractNum w:abstractNumId="25" w15:restartNumberingAfterBreak="0">
+  <w:abstractNum w:abstractNumId="26" w15:restartNumberingAfterBreak="0">
     <w:nsid w:val="73042CFE"/>
     <w:multiLevelType w:val="multilevel"/>
     <w:tmpl w:val="B7D0563C"/>
@@ -8696,7 +8818,7 @@
       </w:rPr>
     </w:lvl>
   </w:abstractNum>
-  <w:abstractNum w:abstractNumId="26" w15:restartNumberingAfterBreak="0">
+  <w:abstractNum w:abstractNumId="27" w15:restartNumberingAfterBreak="0">
     <w:nsid w:val="733B6566"/>
     <w:multiLevelType w:val="multilevel"/>
     <w:tmpl w:val="F2DEE4F0"/>
@@ -8811,7 +8933,7 @@
       </w:rPr>
     </w:lvl>
   </w:abstractNum>
-  <w:abstractNum w:abstractNumId="27" w15:restartNumberingAfterBreak="0">
+  <w:abstractNum w:abstractNumId="28" w15:restartNumberingAfterBreak="0">
     <w:nsid w:val="75CC7139"/>
     <w:multiLevelType w:val="multilevel"/>
     <w:tmpl w:val="F2DEE4F0"/>
@@ -8927,31 +9049,31 @@
     </w:lvl>
   </w:abstractNum>
   <w:num w:numId="1" w16cid:durableId="1831286183">
-    <w:abstractNumId w:val="17"/>
+    <w:abstractNumId w:val="18"/>
   </w:num>
   <w:num w:numId="2" w16cid:durableId="240218030">
-    <w:abstractNumId w:val="27"/>
+    <w:abstractNumId w:val="28"/>
   </w:num>
   <w:num w:numId="3" w16cid:durableId="194198270">
-    <w:abstractNumId w:val="14"/>
+    <w:abstractNumId w:val="15"/>
   </w:num>
   <w:num w:numId="4" w16cid:durableId="642199207">
-    <w:abstractNumId w:val="23"/>
+    <w:abstractNumId w:val="24"/>
   </w:num>
   <w:num w:numId="5" w16cid:durableId="1215238597">
     <w:abstractNumId w:val="4"/>
   </w:num>
   <w:num w:numId="6" w16cid:durableId="965309605">
-    <w:abstractNumId w:val="22"/>
+    <w:abstractNumId w:val="23"/>
   </w:num>
   <w:num w:numId="7" w16cid:durableId="1981180544">
     <w:abstractNumId w:val="11"/>
   </w:num>
   <w:num w:numId="8" w16cid:durableId="1884252413">
-    <w:abstractNumId w:val="19"/>
+    <w:abstractNumId w:val="20"/>
   </w:num>
   <w:num w:numId="9" w16cid:durableId="1493251914">
-    <w:abstractNumId w:val="23"/>
+    <w:abstractNumId w:val="24"/>
     <w:lvlOverride w:ilvl="0">
       <w:startOverride w:val="1"/>
     </w:lvlOverride>
@@ -8981,7 +9103,7 @@
     </w:lvlOverride>
   </w:num>
   <w:num w:numId="10" w16cid:durableId="1586568908">
-    <w:abstractNumId w:val="17"/>
+    <w:abstractNumId w:val="18"/>
     <w:lvlOverride w:ilvl="0">
       <w:startOverride w:val="1"/>
     </w:lvlOverride>
@@ -9017,22 +9139,22 @@
     <w:abstractNumId w:val="9"/>
   </w:num>
   <w:num w:numId="13" w16cid:durableId="166479130">
-    <w:abstractNumId w:val="13"/>
+    <w:abstractNumId w:val="14"/>
   </w:num>
   <w:num w:numId="14" w16cid:durableId="728190883">
     <w:abstractNumId w:val="6"/>
   </w:num>
   <w:num w:numId="15" w16cid:durableId="2123064338">
-    <w:abstractNumId w:val="18"/>
+    <w:abstractNumId w:val="19"/>
   </w:num>
   <w:num w:numId="16" w16cid:durableId="1303466853">
     <w:abstractNumId w:val="8"/>
   </w:num>
   <w:num w:numId="17" w16cid:durableId="1092238466">
-    <w:abstractNumId w:val="15"/>
+    <w:abstractNumId w:val="16"/>
   </w:num>
   <w:num w:numId="18" w16cid:durableId="980697081">
-    <w:abstractNumId w:val="20"/>
+    <w:abstractNumId w:val="21"/>
   </w:num>
   <w:num w:numId="19" w16cid:durableId="766928322">
     <w:abstractNumId w:val="0"/>
@@ -9041,16 +9163,16 @@
     <w:abstractNumId w:val="3"/>
   </w:num>
   <w:num w:numId="21" w16cid:durableId="1099594557">
-    <w:abstractNumId w:val="25"/>
+    <w:abstractNumId w:val="26"/>
   </w:num>
   <w:num w:numId="22" w16cid:durableId="2143229883">
     <w:abstractNumId w:val="7"/>
   </w:num>
   <w:num w:numId="23" w16cid:durableId="2088140315">
-    <w:abstractNumId w:val="16"/>
+    <w:abstractNumId w:val="17"/>
   </w:num>
   <w:num w:numId="24" w16cid:durableId="1216773326">
-    <w:abstractNumId w:val="26"/>
+    <w:abstractNumId w:val="27"/>
   </w:num>
   <w:num w:numId="25" w16cid:durableId="1695690130">
     <w:abstractNumId w:val="10"/>
@@ -9059,7 +9181,7 @@
     <w:abstractNumId w:val="12"/>
   </w:num>
   <w:num w:numId="27" w16cid:durableId="257493051">
-    <w:abstractNumId w:val="24"/>
+    <w:abstractNumId w:val="25"/>
   </w:num>
   <w:num w:numId="28" w16cid:durableId="1632783251">
     <w:abstractNumId w:val="2"/>
@@ -9068,7 +9190,10 @@
     <w:abstractNumId w:val="5"/>
   </w:num>
   <w:num w:numId="30" w16cid:durableId="1850439937">
-    <w:abstractNumId w:val="21"/>
+    <w:abstractNumId w:val="22"/>
+  </w:num>
+  <w:num w:numId="31" w16cid:durableId="1883320642">
+    <w:abstractNumId w:val="13"/>
   </w:num>
   <w:numIdMacAtCleanup w:val="6"/>
 </w:numbering>

</xml_diff>